<commit_message>
Report and README: document the MuRIL fine-tuning run
</commit_message>
<xml_diff>
--- a/report/LoanShield_Case_Study_Report.docx
+++ b/report/LoanShield_Case_Study_Report.docx
@@ -2740,7 +2740,7 @@
       </w:pPr>
       <w:r>
         <w:rPr/>
-        <w:t>Logistic Regression with L2 regularisation served as an interpretable baseline. Random Forest was included because it handles mixed feature types and non-linear interactions with little tuning. XGBoost [14] and LightGBM [17] are gradient-boosted trees that typically perform well on tabular data and natively support class weighting. For review text, TF-IDF (word and character n-grams) with Logistic Regression and with a linear SVM provided classical baselines, each also trained on reviews in which every app's own brand words were masked. MuRIL [13] and a multilingual sentence encoder [20] were used as frozen encoders, with standardised mean-pooled embeddings fed to a logistic regression, because no GPU was available for fine-tuning. App-level text predictions were obtained by averaging review-level probabilities. The tabular and text outputs were combined by a stacked logistic meta-classifier trained on out-of-fold predictions, so that apps with no reviews still receive a metadata-based score.</w:t>
+        <w:t>Logistic Regression with L2 regularisation served as an interpretable baseline. Random Forest was included because it handles mixed feature types and non-linear interactions with little tuning. XGBoost [14] and LightGBM [17] are gradient-boosted trees that typically perform well on tabular data and natively support class weighting. For review text, TF-IDF (word and character n-grams) with Logistic Regression and with a linear SVM provided classical baselines, each also trained on reviews in which every app's own brand words were masked. MuRIL [13] and a multilingual sentence encoder [20] were used as frozen encoders, with standardised mean-pooled embeddings fed to a logistic regression. We also fine-tuned MuRIL end to end on a Colab GPU (learning rate 2e-5, batch 16, 4 epochs, at most 40 reviews per app, class-weighted cross-entropy) on the same developer-grouped folds. App-level text predictions were obtained by averaging review-level probabilities. The tabular and text outputs were combined by a stacked logistic meta-classifier trained on out-of-fold predictions, so that apps with no reviews still receive a metadata-based score.</w:t>
       </w:r>
     </w:p>
     <w:p>
@@ -5844,7 +5844,7 @@
       </w:r>
       <w:r>
         <w:rPr/>
-        <w:t>), which indicates that they need task fine-tuning rather than off-the-shelf sentence vectors. Stacking logistic regression with the TF-IDF model gave the highest mean PR-AUC across folds (</w:t>
+        <w:t>), so off-the-shelf sentence vectors do not carry the signal. Fine-tuning MuRIL on a GPU did not help either: with about 320 training apps per fold, training loss stayed near chance and one fold collapsed to a constant output, so it is excluded from the comparison. Stacking logistic regression with the TF-IDF model gave the highest mean PR-AUC across folds (</w:t>
       </w:r>
       <w:r>
         <w:rPr/>
@@ -8849,7 +8849,7 @@
       </w:r>
       <w:r>
         <w:rPr/>
-        <w:t>. Reviews cover only each app's newest 200, and the frozen transformers were not fine-tuned. External validity is limited to Google Play and Android; apps distributed through direct APK links on messaging platforms are out of scope. Finally, collection respected platform rate limits, and no personal data of reviewers was retained beyond review text.</w:t>
+        <w:t>. Reviews cover only each app's newest 200, and fine-tuning MuRIL on about 320 training apps per fold did not converge: training loss stayed near 0.67 (chance is 0.69), one fold collapsed to a near-constant output, and app scores spanned only 0.37 to 0.49, so the fine-tuned model is not reported among the results. External validity is limited to Google Play and Android; apps distributed through direct APK links on messaging platforms are out of scope. Finally, collection respected platform rate limits, and no personal data of reviewers was retained beyond review text.</w:t>
       </w:r>
     </w:p>
     <w:p>
@@ -8899,7 +8899,7 @@
       </w:r>
       <w:r>
         <w:rPr/>
-        <w:t>, held up on newer releases and in the first fortnight after release, and detected apps with no identifiable regulated lender at least as well as unlisted apps of regulated ones. The most informative evidence was whether a listing names its regulated lending partner and states its loan terms, together with its permission profile; review text added little. Future work includes a larger unverified class through repeated snapshots and APK sources, double annotation, fine-tuning multilingual transformers, extending coverage to iOS and sideloaded APKs, adding dynamic analysis of network behaviour, monitoring model drift as operators adapt, and partnering with regulators to validate flagged apps.</w:t>
+        <w:t>, held up on newer releases and in the first fortnight after release, and detected apps with no identifiable regulated lender at least as well as unlisted apps of regulated ones. The most informative evidence was whether a listing names its regulated lending partner and states its loan terms, together with its permission profile; review text added little. Future work includes a larger unverified class through repeated snapshots and APK sources, double annotation, fine-tuning multilingual transformers once far more labelled apps are available, extending coverage to iOS and sideloaded APKs, adding dynamic analysis of network behaviour, monitoring model drift as operators adapt, and partnering with regulators to validate flagged apps.</w:t>
       </w:r>
     </w:p>
     <w:p>

</xml_diff>